<commit_message>
Docs: final report (deploy section, 20/20 results, real screenshot, image sources) + code guide update
Co-Authored-By: Claude Opus 5.5 (1M context) <noreply@anthropic.com>
</commit_message>
<xml_diff>
--- a/docs/CODE_GUIDE.docx
+++ b/docs/CODE_GUIDE.docx
@@ -2972,6 +2972,86 @@
         <w:t xml:space="preserve"> — ★ ลำดับ 5 ขั้น</w:t>
       </w:r>
     </w:p>
+    <w:p>
+      <w:pPr>
+        <w:jc w:val="center"/>
+      </w:pPr>
+      <w:r>
+        <w:drawing>
+          <wp:inline xmlns:a="http://schemas.openxmlformats.org/drawingml/2006/main" xmlns:pic="http://schemas.openxmlformats.org/drawingml/2006/picture">
+            <wp:extent cx="5976000" cy="5736960"/>
+            <wp:docPr id="1" name="Picture 1"/>
+            <wp:cNvGraphicFramePr>
+              <a:graphicFrameLocks noChangeAspect="1"/>
+            </wp:cNvGraphicFramePr>
+            <a:graphic>
+              <a:graphicData uri="http://schemas.openxmlformats.org/drawingml/2006/picture">
+                <pic:pic>
+                  <pic:nvPicPr>
+                    <pic:cNvPr id="0" name="chat_flow.png"/>
+                    <pic:cNvPicPr/>
+                  </pic:nvPicPr>
+                  <pic:blipFill>
+                    <a:blip r:embed="rId9"/>
+                    <a:stretch>
+                      <a:fillRect/>
+                    </a:stretch>
+                  </pic:blipFill>
+                  <pic:spPr>
+                    <a:xfrm>
+                      <a:off x="0" y="0"/>
+                      <a:ext cx="5976000" cy="5736960"/>
+                    </a:xfrm>
+                    <a:prstGeom prst="rect"/>
+                  </pic:spPr>
+                </pic:pic>
+              </a:graphicData>
+            </a:graphic>
+          </wp:inline>
+        </w:drawing>
+      </w:r>
+    </w:p>
+    <w:p>
+      <w:pPr>
+        <w:ind w:left="283"/>
+      </w:pPr>
+      <w:r>
+        <w:rPr>
+          <w:rFonts w:ascii="Leelawadee UI" w:hAnsi="Leelawadee UI" w:cs="Leelawadee UI" w:eastAsia="Leelawadee UI"/>
+          <w:color w:val="66756B"/>
+          <w:sz w:val="19"/>
+          <w:szCs w:val="19"/>
+        </w:rPr>
+        <w:t xml:space="preserve">ภาพใหญ่: </w:t>
+      </w:r>
+      <w:r>
+        <w:rPr>
+          <w:rFonts w:ascii="Leelawadee UI" w:hAnsi="Leelawadee UI" w:cs="Leelawadee UI" w:eastAsia="Leelawadee UI"/>
+          <w:color w:val="3E8E5A"/>
+          <w:sz w:val="19"/>
+          <w:szCs w:val="19"/>
+        </w:rPr>
+        <w:t>docs/report/img/chat_flow.png</w:t>
+      </w:r>
+      <w:r>
+        <w:rPr>
+          <w:rFonts w:ascii="Leelawadee UI" w:hAnsi="Leelawadee UI" w:cs="Leelawadee UI" w:eastAsia="Leelawadee UI"/>
+          <w:color w:val="66756B"/>
+          <w:sz w:val="19"/>
+          <w:szCs w:val="19"/>
+        </w:rPr>
+        <w:t xml:space="preserve"> · แก้ภาพที่ </w:t>
+      </w:r>
+      <w:r>
+        <w:rPr>
+          <w:rFonts w:ascii="Leelawadee UI" w:hAnsi="Leelawadee UI" w:cs="Leelawadee UI" w:eastAsia="Leelawadee UI"/>
+          <w:color w:val="3E8E5A"/>
+          <w:sz w:val="19"/>
+          <w:szCs w:val="19"/>
+        </w:rPr>
+        <w:t>chat_flow.html</w:t>
+      </w:r>
+    </w:p>
     <w:tbl>
       <w:tblPr>
         <w:tblStyle w:val="TableGrid"/>
@@ -10896,7 +10976,7 @@
           <w:sz w:val="26"/>
           <w:szCs w:val="26"/>
         </w:rPr>
-        <w:t xml:space="preserve"> — embedding ในเครื่อง</w:t>
+        <w:t xml:space="preserve"> — embedding (ในเครื่อง / ตอน deploy)</w:t>
       </w:r>
     </w:p>
     <w:tbl>
@@ -10964,7 +11044,7 @@
                 <w:sz w:val="18"/>
                 <w:szCs w:val="18"/>
               </w:rPr>
-              <w:t>1–10</w:t>
+              <w:t>1–15</w:t>
             </w:r>
           </w:p>
         </w:tc>
@@ -10980,7 +11060,7 @@
                 <w:sz w:val="18"/>
                 <w:szCs w:val="18"/>
               </w:rPr>
-              <w:t>เหตุผลที่ใช้ bge-m3 ในเครื่อง + onnxruntime</w:t>
+              <w:t>เหตุผลที่ใช้ bge-m3 ในเครื่อง + onnxruntime และทำไมตอน deploy ใช้ Gemini</w:t>
             </w:r>
           </w:p>
         </w:tc>
@@ -10999,7 +11079,7 @@
                 <w:sz w:val="18"/>
                 <w:szCs w:val="18"/>
               </w:rPr>
-              <w:t>24–40</w:t>
+              <w:t>30–34</w:t>
             </w:r>
           </w:p>
         </w:tc>
@@ -11017,78 +11097,16 @@
                 <w:sz w:val="17"/>
                 <w:szCs w:val="17"/>
               </w:rPr>
-              <w:t>_load()</w:t>
-            </w:r>
-            <w:r>
-              <w:rPr>
-                <w:rFonts w:ascii="Leelawadee UI" w:hAnsi="Leelawadee UI" w:cs="Leelawadee UI" w:eastAsia="Leelawadee UI"/>
-                <w:sz w:val="18"/>
-                <w:szCs w:val="18"/>
-              </w:rPr>
-              <w:t xml:space="preserve"> โหลด tokenizer + โมเดล ONNX ครั้งเดียว · ตัดข้อความที่ 512 token</w:t>
-            </w:r>
-          </w:p>
-        </w:tc>
-      </w:tr>
-      <w:tr>
-        <w:tc>
-          <w:tcPr>
-            <w:tcW w:type="dxa" w:w="1814"/>
-          </w:tcPr>
-          <w:p>
-            <w:r/>
-            <w:r>
-              <w:rPr>
-                <w:rFonts w:ascii="Leelawadee UI" w:hAnsi="Leelawadee UI" w:cs="Leelawadee UI" w:eastAsia="Leelawadee UI"/>
-                <w:color w:val="3E8E5A"/>
-                <w:sz w:val="18"/>
-                <w:szCs w:val="18"/>
-              </w:rPr>
-              <w:t>36–37</w:t>
-            </w:r>
-          </w:p>
-        </w:tc>
-        <w:tc>
-          <w:tcPr>
-            <w:tcW w:type="dxa" w:w="7200"/>
-          </w:tcPr>
-          <w:p>
-            <w:r/>
-            <w:r>
-              <w:rPr>
-                <w:rFonts w:ascii="Leelawadee UI" w:hAnsi="Leelawadee UI" w:cs="Leelawadee UI" w:eastAsia="Leelawadee UI"/>
-                <w:sz w:val="18"/>
-                <w:szCs w:val="18"/>
-              </w:rPr>
-              <w:t>ใช้ 1 thread (วัดแล้วเร็วกว่า 16 thread 13 เท่าบน CPU นี้)</w:t>
-            </w:r>
-          </w:p>
-        </w:tc>
-      </w:tr>
-      <w:tr>
-        <w:tc>
-          <w:tcPr>
-            <w:tcW w:type="dxa" w:w="1814"/>
-          </w:tcPr>
-          <w:p>
-            <w:r/>
-            <w:r>
-              <w:rPr>
-                <w:rFonts w:ascii="Leelawadee UI" w:hAnsi="Leelawadee UI" w:cs="Leelawadee UI" w:eastAsia="Leelawadee UI"/>
-                <w:color w:val="3E8E5A"/>
-                <w:sz w:val="18"/>
-                <w:szCs w:val="18"/>
-              </w:rPr>
-              <w:t>43–58</w:t>
-            </w:r>
-          </w:p>
-        </w:tc>
-        <w:tc>
-          <w:tcPr>
-            <w:tcW w:type="dxa" w:w="7200"/>
-          </w:tcPr>
-          <w:p>
-            <w:r/>
+              <w:t>EMBEDDING_PROVIDER</w:t>
+            </w:r>
+            <w:r>
+              <w:rPr>
+                <w:rFonts w:ascii="Leelawadee UI" w:hAnsi="Leelawadee UI" w:cs="Leelawadee UI" w:eastAsia="Leelawadee UI"/>
+                <w:sz w:val="18"/>
+                <w:szCs w:val="18"/>
+              </w:rPr>
+              <w:t xml:space="preserve"> เลือกโหมด: </w:t>
+            </w:r>
             <w:r>
               <w:rPr>
                 <w:rFonts w:ascii="Consolas" w:hAnsi="Consolas" w:cs="Leelawadee UI" w:eastAsia="Consolas"/>
@@ -11097,6 +11115,248 @@
                 <w:sz w:val="17"/>
                 <w:szCs w:val="17"/>
               </w:rPr>
+              <w:t>local</w:t>
+            </w:r>
+            <w:r>
+              <w:rPr>
+                <w:rFonts w:ascii="Leelawadee UI" w:hAnsi="Leelawadee UI" w:cs="Leelawadee UI" w:eastAsia="Leelawadee UI"/>
+                <w:sz w:val="18"/>
+                <w:szCs w:val="18"/>
+              </w:rPr>
+              <w:t xml:space="preserve"> (ค่าเริ่มต้น) หรือ </w:t>
+            </w:r>
+            <w:r>
+              <w:rPr>
+                <w:rFonts w:ascii="Consolas" w:hAnsi="Consolas" w:cs="Leelawadee UI" w:eastAsia="Consolas"/>
+                <w:b w:val="0"/>
+                <w:color w:val="9A3B26"/>
+                <w:sz w:val="17"/>
+                <w:szCs w:val="17"/>
+              </w:rPr>
+              <w:t>gemini</w:t>
+            </w:r>
+            <w:r>
+              <w:rPr>
+                <w:rFonts w:ascii="Leelawadee UI" w:hAnsi="Leelawadee UI" w:cs="Leelawadee UI" w:eastAsia="Leelawadee UI"/>
+                <w:sz w:val="18"/>
+                <w:szCs w:val="18"/>
+              </w:rPr>
+              <w:t xml:space="preserve"> (บน Render) · เพดาน 90 ข้อความ/นาที</w:t>
+            </w:r>
+          </w:p>
+        </w:tc>
+      </w:tr>
+      <w:tr>
+        <w:tc>
+          <w:tcPr>
+            <w:tcW w:type="dxa" w:w="1814"/>
+          </w:tcPr>
+          <w:p>
+            <w:r/>
+            <w:r>
+              <w:rPr>
+                <w:rFonts w:ascii="Leelawadee UI" w:hAnsi="Leelawadee UI" w:cs="Leelawadee UI" w:eastAsia="Leelawadee UI"/>
+                <w:color w:val="3E8E5A"/>
+                <w:sz w:val="18"/>
+                <w:szCs w:val="18"/>
+              </w:rPr>
+              <w:t>37–53</w:t>
+            </w:r>
+          </w:p>
+        </w:tc>
+        <w:tc>
+          <w:tcPr>
+            <w:tcW w:type="dxa" w:w="7200"/>
+          </w:tcPr>
+          <w:p>
+            <w:r/>
+            <w:r>
+              <w:rPr>
+                <w:rFonts w:ascii="Consolas" w:hAnsi="Consolas" w:cs="Leelawadee UI" w:eastAsia="Consolas"/>
+                <w:b w:val="0"/>
+                <w:color w:val="9A3B26"/>
+                <w:sz w:val="17"/>
+                <w:szCs w:val="17"/>
+              </w:rPr>
+              <w:t>_load()</w:t>
+            </w:r>
+            <w:r>
+              <w:rPr>
+                <w:rFonts w:ascii="Leelawadee UI" w:hAnsi="Leelawadee UI" w:cs="Leelawadee UI" w:eastAsia="Leelawadee UI"/>
+                <w:sz w:val="18"/>
+                <w:szCs w:val="18"/>
+              </w:rPr>
+              <w:t xml:space="preserve"> โหลด tokenizer + โมเดล ONNX ครั้งเดียว · ตัดข้อความที่ 512 token</w:t>
+            </w:r>
+          </w:p>
+        </w:tc>
+      </w:tr>
+      <w:tr>
+        <w:tc>
+          <w:tcPr>
+            <w:tcW w:type="dxa" w:w="1814"/>
+          </w:tcPr>
+          <w:p>
+            <w:r/>
+            <w:r>
+              <w:rPr>
+                <w:rFonts w:ascii="Leelawadee UI" w:hAnsi="Leelawadee UI" w:cs="Leelawadee UI" w:eastAsia="Leelawadee UI"/>
+                <w:color w:val="3E8E5A"/>
+                <w:sz w:val="18"/>
+                <w:szCs w:val="18"/>
+              </w:rPr>
+              <w:t>50</w:t>
+            </w:r>
+          </w:p>
+        </w:tc>
+        <w:tc>
+          <w:tcPr>
+            <w:tcW w:type="dxa" w:w="7200"/>
+          </w:tcPr>
+          <w:p>
+            <w:r/>
+            <w:r>
+              <w:rPr>
+                <w:rFonts w:ascii="Leelawadee UI" w:hAnsi="Leelawadee UI" w:cs="Leelawadee UI" w:eastAsia="Leelawadee UI"/>
+                <w:sz w:val="18"/>
+                <w:szCs w:val="18"/>
+              </w:rPr>
+              <w:t>ใช้ 1 thread (วัดแล้วเร็วกว่า 16 thread 13 เท่าบน CPU นี้)</w:t>
+            </w:r>
+          </w:p>
+        </w:tc>
+      </w:tr>
+      <w:tr>
+        <w:tc>
+          <w:tcPr>
+            <w:tcW w:type="dxa" w:w="1814"/>
+          </w:tcPr>
+          <w:p>
+            <w:r/>
+            <w:r>
+              <w:rPr>
+                <w:rFonts w:ascii="Leelawadee UI" w:hAnsi="Leelawadee UI" w:cs="Leelawadee UI" w:eastAsia="Leelawadee UI"/>
+                <w:color w:val="3E8E5A"/>
+                <w:sz w:val="18"/>
+                <w:szCs w:val="18"/>
+              </w:rPr>
+              <w:t>56–64</w:t>
+            </w:r>
+          </w:p>
+        </w:tc>
+        <w:tc>
+          <w:tcPr>
+            <w:tcW w:type="dxa" w:w="7200"/>
+          </w:tcPr>
+          <w:p>
+            <w:r/>
+            <w:r>
+              <w:rPr>
+                <w:rFonts w:ascii="Consolas" w:hAnsi="Consolas" w:cs="Leelawadee UI" w:eastAsia="Consolas"/>
+                <w:b w:val="0"/>
+                <w:color w:val="9A3B26"/>
+                <w:sz w:val="17"/>
+                <w:szCs w:val="17"/>
+              </w:rPr>
+              <w:t>_wait_quota()</w:t>
+            </w:r>
+            <w:r>
+              <w:rPr>
+                <w:rFonts w:ascii="Leelawadee UI" w:hAnsi="Leelawadee UI" w:cs="Leelawadee UI" w:eastAsia="Leelawadee UI"/>
+                <w:sz w:val="18"/>
+                <w:szCs w:val="18"/>
+              </w:rPr>
+              <w:t xml:space="preserve"> รอให้จำนวนข้อความใน 60 วินาทีล่าสุดไม่เกินโควต้าฟรี</w:t>
+            </w:r>
+          </w:p>
+        </w:tc>
+      </w:tr>
+      <w:tr>
+        <w:tc>
+          <w:tcPr>
+            <w:tcW w:type="dxa" w:w="1814"/>
+          </w:tcPr>
+          <w:p>
+            <w:r/>
+            <w:r>
+              <w:rPr>
+                <w:rFonts w:ascii="Leelawadee UI" w:hAnsi="Leelawadee UI" w:cs="Leelawadee UI" w:eastAsia="Leelawadee UI"/>
+                <w:color w:val="3E8E5A"/>
+                <w:sz w:val="18"/>
+                <w:szCs w:val="18"/>
+              </w:rPr>
+              <w:t>67–83</w:t>
+            </w:r>
+          </w:p>
+        </w:tc>
+        <w:tc>
+          <w:tcPr>
+            <w:tcW w:type="dxa" w:w="7200"/>
+          </w:tcPr>
+          <w:p>
+            <w:r/>
+            <w:r>
+              <w:rPr>
+                <w:rFonts w:ascii="Consolas" w:hAnsi="Consolas" w:cs="Leelawadee UI" w:eastAsia="Consolas"/>
+                <w:b w:val="0"/>
+                <w:color w:val="9A3B26"/>
+                <w:sz w:val="17"/>
+                <w:szCs w:val="17"/>
+              </w:rPr>
+              <w:t>_embed_gemini()</w:t>
+            </w:r>
+            <w:r>
+              <w:rPr>
+                <w:rFonts w:ascii="Leelawadee UI" w:hAnsi="Leelawadee UI" w:cs="Leelawadee UI" w:eastAsia="Leelawadee UI"/>
+                <w:sz w:val="18"/>
+                <w:szCs w:val="18"/>
+              </w:rPr>
+              <w:t xml:space="preserve"> เรียก gemini-embedding-001 ขอ 1024 มิติ (ขนาดเท่า bge-m3) แล้ว normalize ใหม่ · ได้ 429 รอแล้วลองใหม่</w:t>
+            </w:r>
+          </w:p>
+        </w:tc>
+      </w:tr>
+      <w:tr>
+        <w:tc>
+          <w:tcPr>
+            <w:tcW w:type="dxa" w:w="1814"/>
+          </w:tcPr>
+          <w:p>
+            <w:r/>
+            <w:r>
+              <w:rPr>
+                <w:rFonts w:ascii="Leelawadee UI" w:hAnsi="Leelawadee UI" w:cs="Leelawadee UI" w:eastAsia="Leelawadee UI"/>
+                <w:color w:val="3E8E5A"/>
+                <w:sz w:val="18"/>
+                <w:szCs w:val="18"/>
+              </w:rPr>
+              <w:t>86–</w:t>
+            </w:r>
+            <w:r>
+              <w:rPr>
+                <w:rFonts w:ascii="Leelawadee UI" w:hAnsi="Leelawadee UI" w:cs="Leelawadee UI" w:eastAsia="Leelawadee UI"/>
+                <w:color w:val="66756B"/>
+                <w:sz w:val="15"/>
+                <w:szCs w:val="15"/>
+              </w:rPr>
+              <w:t xml:space="preserve"> (L86)</w:t>
+            </w:r>
+          </w:p>
+        </w:tc>
+        <w:tc>
+          <w:tcPr>
+            <w:tcW w:type="dxa" w:w="7200"/>
+          </w:tcPr>
+          <w:p>
+            <w:r/>
+            <w:r>
+              <w:rPr>
+                <w:rFonts w:ascii="Consolas" w:hAnsi="Consolas" w:cs="Leelawadee UI" w:eastAsia="Consolas"/>
+                <w:b w:val="0"/>
+                <w:color w:val="9A3B26"/>
+                <w:sz w:val="17"/>
+                <w:szCs w:val="17"/>
+              </w:rPr>
               <w:t>embed()</w:t>
             </w:r>
             <w:r>
@@ -11105,13 +11365,56 @@
                 <w:sz w:val="18"/>
                 <w:szCs w:val="18"/>
               </w:rPr>
-              <w:t xml:space="preserve"> ข้อความ → token → โมเดล → เอาเวกเตอร์ของ token แรก ([CLS]) → normalize ยาว 1 → 1,024 มิติ</w:t>
+              <w:t xml:space="preserve"> โหมด local: ข้อความ → token → โมเดล → เวกเตอร์ของ token แรก ([CLS]) → normalize ยาว 1 → 1,024 มิติ</w:t>
             </w:r>
           </w:p>
         </w:tc>
       </w:tr>
     </w:tbl>
     <w:p/>
+    <w:p>
+      <w:pPr>
+        <w:ind w:left="283"/>
+      </w:pPr>
+      <w:r>
+        <w:rPr>
+          <w:rFonts w:ascii="Leelawadee UI" w:hAnsi="Leelawadee UI" w:cs="Leelawadee UI" w:eastAsia="Leelawadee UI"/>
+          <w:b/>
+          <w:color w:val="66756B"/>
+          <w:sz w:val="19"/>
+          <w:szCs w:val="19"/>
+        </w:rPr>
+        <w:t>อาจโดนถาม:</w:t>
+      </w:r>
+      <w:r>
+        <w:rPr>
+          <w:rFonts w:ascii="Leelawadee UI" w:hAnsi="Leelawadee UI" w:cs="Leelawadee UI" w:eastAsia="Leelawadee UI"/>
+          <w:color w:val="66756B"/>
+          <w:sz w:val="19"/>
+          <w:szCs w:val="19"/>
+        </w:rPr>
+        <w:t xml:space="preserve"> ทำไมบน Render ไม่ใช้ bge-m3? → Render free มี RAM 512 MB แต่ bge-m3 ใช้ ~1.2 GB · เวกเตอร์ Gemini กับ bge-m3 คนละแบบ จึงต้องมีคลังแยก </w:t>
+      </w:r>
+      <w:r>
+        <w:rPr>
+          <w:rFonts w:ascii="Consolas" w:hAnsi="Consolas" w:cs="Leelawadee UI" w:eastAsia="Consolas"/>
+          <w:b w:val="0"/>
+          <w:color w:val="9A3B26"/>
+          <w:sz w:val="18"/>
+          <w:szCs w:val="18"/>
+        </w:rPr>
+        <w:t>storage/lightrag_gemini</w:t>
+      </w:r>
+      <w:r>
+        <w:rPr>
+          <w:rFonts w:ascii="Leelawadee UI" w:hAnsi="Leelawadee UI" w:cs="Leelawadee UI" w:eastAsia="Leelawadee UI"/>
+          <w:color w:val="66756B"/>
+          <w:sz w:val="19"/>
+          <w:szCs w:val="19"/>
+        </w:rPr>
+        <w:t xml:space="preserve"> (graph เดียวกัน ต่างแค่เวกเตอร์)</w:t>
+      </w:r>
+    </w:p>
     <w:p>
       <w:pPr>
         <w:ind w:left="283"/>
@@ -11978,6 +12281,338 @@
       </w:tr>
     </w:tbl>
     <w:p/>
+    <w:p>
+      <w:pPr>
+        <w:keepNext/>
+        <w:spacing w:before="280"/>
+      </w:pPr>
+      <w:r>
+        <w:rPr>
+          <w:rFonts w:ascii="Leelawadee UI" w:hAnsi="Leelawadee UI" w:cs="Leelawadee UI" w:eastAsia="Leelawadee UI"/>
+          <w:b/>
+          <w:color w:val="1F5E3B"/>
+          <w:sz w:val="32"/>
+          <w:szCs w:val="32"/>
+        </w:rPr>
+        <w:t>4.1 Deploy — Docker + Render</w:t>
+      </w:r>
+    </w:p>
+    <w:tbl>
+      <w:tblPr>
+        <w:tblStyle w:val="TableGrid"/>
+        <w:tblW w:type="auto" w:w="0"/>
+        <w:jc w:val="center"/>
+        <w:tblLook w:firstColumn="1" w:firstRow="1" w:lastColumn="0" w:lastRow="0" w:noHBand="0" w:noVBand="1" w:val="04A0"/>
+      </w:tblPr>
+      <w:tblGrid>
+        <w:gridCol w:w="4706"/>
+        <w:gridCol w:w="4706"/>
+      </w:tblGrid>
+      <w:tr>
+        <w:tc>
+          <w:tcPr>
+            <w:tcW w:type="dxa" w:w="1814"/>
+            <w:shd w:val="clear" w:fill="DCEBDF"/>
+          </w:tcPr>
+          <w:p>
+            <w:r/>
+            <w:r>
+              <w:rPr>
+                <w:rFonts w:ascii="Leelawadee UI" w:hAnsi="Leelawadee UI" w:cs="Leelawadee UI" w:eastAsia="Leelawadee UI"/>
+                <w:b/>
+                <w:color w:val="1F5E3B"/>
+                <w:sz w:val="18"/>
+                <w:szCs w:val="18"/>
+              </w:rPr>
+              <w:t>ไฟล์</w:t>
+            </w:r>
+          </w:p>
+        </w:tc>
+        <w:tc>
+          <w:tcPr>
+            <w:tcW w:type="dxa" w:w="7200"/>
+            <w:shd w:val="clear" w:fill="DCEBDF"/>
+          </w:tcPr>
+          <w:p>
+            <w:r/>
+            <w:r>
+              <w:rPr>
+                <w:rFonts w:ascii="Leelawadee UI" w:hAnsi="Leelawadee UI" w:cs="Leelawadee UI" w:eastAsia="Leelawadee UI"/>
+                <w:b/>
+                <w:color w:val="1F5E3B"/>
+                <w:sz w:val="18"/>
+                <w:szCs w:val="18"/>
+              </w:rPr>
+              <w:t>ทำอะไร</w:t>
+            </w:r>
+          </w:p>
+        </w:tc>
+      </w:tr>
+      <w:tr>
+        <w:tc>
+          <w:tcPr>
+            <w:tcW w:type="dxa" w:w="1814"/>
+          </w:tcPr>
+          <w:p>
+            <w:r/>
+            <w:r>
+              <w:rPr>
+                <w:rFonts w:ascii="Leelawadee UI" w:hAnsi="Leelawadee UI" w:cs="Leelawadee UI" w:eastAsia="Leelawadee UI"/>
+                <w:color w:val="3E8E5A"/>
+                <w:sz w:val="18"/>
+                <w:szCs w:val="18"/>
+              </w:rPr>
+              <w:t>Dockerfile</w:t>
+            </w:r>
+          </w:p>
+        </w:tc>
+        <w:tc>
+          <w:tcPr>
+            <w:tcW w:type="dxa" w:w="7200"/>
+          </w:tcPr>
+          <w:p>
+            <w:r/>
+            <w:r>
+              <w:rPr>
+                <w:rFonts w:ascii="Leelawadee UI" w:hAnsi="Leelawadee UI" w:cs="Leelawadee UI" w:eastAsia="Leelawadee UI"/>
+                <w:sz w:val="18"/>
+                <w:szCs w:val="18"/>
+              </w:rPr>
+              <w:t>image เดียว: ติดตั้ง dependency ด้วย uv (แยก 2 venv: โปรเจกต์หลัก + rag/) แล้วคัดลอกโค้ด ข้อมูลร้าน และคลังที่ index แล้ว (ไม่มีโมเดล bge-m3)</w:t>
+            </w:r>
+          </w:p>
+        </w:tc>
+      </w:tr>
+      <w:tr>
+        <w:tc>
+          <w:tcPr>
+            <w:tcW w:type="dxa" w:w="1814"/>
+          </w:tcPr>
+          <w:p>
+            <w:r/>
+            <w:r>
+              <w:rPr>
+                <w:rFonts w:ascii="Leelawadee UI" w:hAnsi="Leelawadee UI" w:cs="Leelawadee UI" w:eastAsia="Leelawadee UI"/>
+                <w:color w:val="3E8E5A"/>
+                <w:sz w:val="18"/>
+                <w:szCs w:val="18"/>
+              </w:rPr>
+              <w:t>deploy/start.sh</w:t>
+            </w:r>
+          </w:p>
+        </w:tc>
+        <w:tc>
+          <w:tcPr>
+            <w:tcW w:type="dxa" w:w="7200"/>
+          </w:tcPr>
+          <w:p>
+            <w:r/>
+            <w:r>
+              <w:rPr>
+                <w:rFonts w:ascii="Leelawadee UI" w:hAnsi="Leelawadee UI" w:cs="Leelawadee UI" w:eastAsia="Leelawadee UI"/>
+                <w:sz w:val="18"/>
+                <w:szCs w:val="18"/>
+              </w:rPr>
+              <w:t xml:space="preserve">เปิด RAG (:9621) และ Guard (:8001) เบื้องหลังที่ 127.0.0.1 แล้วเปิด Chat API ที่ </w:t>
+            </w:r>
+            <w:r>
+              <w:rPr>
+                <w:rFonts w:ascii="Consolas" w:hAnsi="Consolas" w:cs="Leelawadee UI" w:eastAsia="Consolas"/>
+                <w:b w:val="0"/>
+                <w:color w:val="9A3B26"/>
+                <w:sz w:val="17"/>
+                <w:szCs w:val="17"/>
+              </w:rPr>
+              <w:t>$PORT</w:t>
+            </w:r>
+            <w:r>
+              <w:rPr>
+                <w:rFonts w:ascii="Leelawadee UI" w:hAnsi="Leelawadee UI" w:cs="Leelawadee UI" w:eastAsia="Leelawadee UI"/>
+                <w:sz w:val="18"/>
+                <w:szCs w:val="18"/>
+              </w:rPr>
+              <w:t xml:space="preserve"> ของ Render — ทางเข้าเดียวของลูกค้า · ส่งต่อ key ให้ RAG ใช้ชื่อตัวแปรของ LightRAG</w:t>
+            </w:r>
+          </w:p>
+        </w:tc>
+      </w:tr>
+      <w:tr>
+        <w:tc>
+          <w:tcPr>
+            <w:tcW w:type="dxa" w:w="1814"/>
+          </w:tcPr>
+          <w:p>
+            <w:r/>
+            <w:r>
+              <w:rPr>
+                <w:rFonts w:ascii="Leelawadee UI" w:hAnsi="Leelawadee UI" w:cs="Leelawadee UI" w:eastAsia="Leelawadee UI"/>
+                <w:color w:val="3E8E5A"/>
+                <w:sz w:val="18"/>
+                <w:szCs w:val="18"/>
+              </w:rPr>
+              <w:t>deploy/rag.env</w:t>
+            </w:r>
+          </w:p>
+        </w:tc>
+        <w:tc>
+          <w:tcPr>
+            <w:tcW w:type="dxa" w:w="7200"/>
+          </w:tcPr>
+          <w:p>
+            <w:r/>
+            <w:r>
+              <w:rPr>
+                <w:rFonts w:ascii="Leelawadee UI" w:hAnsi="Leelawadee UI" w:cs="Leelawadee UI" w:eastAsia="Leelawadee UI"/>
+                <w:sz w:val="18"/>
+                <w:szCs w:val="18"/>
+              </w:rPr>
+              <w:t xml:space="preserve">ค่าของ RAG ตอน deploy (ไม่มีความลับ): </w:t>
+            </w:r>
+            <w:r>
+              <w:rPr>
+                <w:rFonts w:ascii="Consolas" w:hAnsi="Consolas" w:cs="Leelawadee UI" w:eastAsia="Consolas"/>
+                <w:b w:val="0"/>
+                <w:color w:val="9A3B26"/>
+                <w:sz w:val="17"/>
+                <w:szCs w:val="17"/>
+              </w:rPr>
+              <w:t>EMBEDDING_PROVIDER=gemini</w:t>
+            </w:r>
+            <w:r>
+              <w:rPr>
+                <w:rFonts w:ascii="Leelawadee UI" w:hAnsi="Leelawadee UI" w:cs="Leelawadee UI" w:eastAsia="Leelawadee UI"/>
+                <w:sz w:val="18"/>
+                <w:szCs w:val="18"/>
+              </w:rPr>
+              <w:t xml:space="preserve">, </w:t>
+            </w:r>
+            <w:r>
+              <w:rPr>
+                <w:rFonts w:ascii="Consolas" w:hAnsi="Consolas" w:cs="Leelawadee UI" w:eastAsia="Consolas"/>
+                <w:b w:val="0"/>
+                <w:color w:val="9A3B26"/>
+                <w:sz w:val="17"/>
+                <w:szCs w:val="17"/>
+              </w:rPr>
+              <w:t>WORKING_DIR=./storage/lightrag_gemini</w:t>
+            </w:r>
+          </w:p>
+        </w:tc>
+      </w:tr>
+      <w:tr>
+        <w:tc>
+          <w:tcPr>
+            <w:tcW w:type="dxa" w:w="1814"/>
+          </w:tcPr>
+          <w:p>
+            <w:r/>
+            <w:r>
+              <w:rPr>
+                <w:rFonts w:ascii="Leelawadee UI" w:hAnsi="Leelawadee UI" w:cs="Leelawadee UI" w:eastAsia="Leelawadee UI"/>
+                <w:color w:val="3E8E5A"/>
+                <w:sz w:val="18"/>
+                <w:szCs w:val="18"/>
+              </w:rPr>
+              <w:t>render.yaml</w:t>
+            </w:r>
+          </w:p>
+        </w:tc>
+        <w:tc>
+          <w:tcPr>
+            <w:tcW w:type="dxa" w:w="7200"/>
+          </w:tcPr>
+          <w:p>
+            <w:r/>
+            <w:r>
+              <w:rPr>
+                <w:rFonts w:ascii="Leelawadee UI" w:hAnsi="Leelawadee UI" w:cs="Leelawadee UI" w:eastAsia="Leelawadee UI"/>
+                <w:sz w:val="18"/>
+                <w:szCs w:val="18"/>
+              </w:rPr>
+              <w:t xml:space="preserve">Blueprint ของ Render: Docker, plan free, health check </w:t>
+            </w:r>
+            <w:r>
+              <w:rPr>
+                <w:rFonts w:ascii="Consolas" w:hAnsi="Consolas" w:cs="Leelawadee UI" w:eastAsia="Consolas"/>
+                <w:b w:val="0"/>
+                <w:color w:val="9A3B26"/>
+                <w:sz w:val="17"/>
+                <w:szCs w:val="17"/>
+              </w:rPr>
+              <w:t>/api/v1/health</w:t>
+            </w:r>
+            <w:r>
+              <w:rPr>
+                <w:rFonts w:ascii="Leelawadee UI" w:hAnsi="Leelawadee UI" w:cs="Leelawadee UI" w:eastAsia="Leelawadee UI"/>
+                <w:sz w:val="18"/>
+                <w:szCs w:val="18"/>
+              </w:rPr>
+              <w:t>, ค่าลับ 2 ตัวกรอกในหน้า Render</w:t>
+            </w:r>
+          </w:p>
+        </w:tc>
+      </w:tr>
+      <w:tr>
+        <w:tc>
+          <w:tcPr>
+            <w:tcW w:type="dxa" w:w="1814"/>
+          </w:tcPr>
+          <w:p>
+            <w:r/>
+            <w:r>
+              <w:rPr>
+                <w:rFonts w:ascii="Leelawadee UI" w:hAnsi="Leelawadee UI" w:cs="Leelawadee UI" w:eastAsia="Leelawadee UI"/>
+                <w:color w:val="3E8E5A"/>
+                <w:sz w:val="18"/>
+                <w:szCs w:val="18"/>
+              </w:rPr>
+              <w:t>.dockerignore</w:t>
+            </w:r>
+          </w:p>
+        </w:tc>
+        <w:tc>
+          <w:tcPr>
+            <w:tcW w:type="dxa" w:w="7200"/>
+          </w:tcPr>
+          <w:p>
+            <w:r/>
+            <w:r>
+              <w:rPr>
+                <w:rFonts w:ascii="Leelawadee UI" w:hAnsi="Leelawadee UI" w:cs="Leelawadee UI" w:eastAsia="Leelawadee UI"/>
+                <w:sz w:val="18"/>
+                <w:szCs w:val="18"/>
+              </w:rPr>
+              <w:t>ไม่เอา .env, .venv, โมเดล bge-m3, คลัง bge-m3, docs, eval เข้า image</w:t>
+            </w:r>
+          </w:p>
+        </w:tc>
+      </w:tr>
+    </w:tbl>
+    <w:p/>
+    <w:p>
+      <w:pPr>
+        <w:ind w:left="283"/>
+      </w:pPr>
+      <w:r>
+        <w:rPr>
+          <w:rFonts w:ascii="Leelawadee UI" w:hAnsi="Leelawadee UI" w:cs="Leelawadee UI" w:eastAsia="Leelawadee UI"/>
+          <w:b/>
+          <w:color w:val="66756B"/>
+          <w:sz w:val="19"/>
+          <w:szCs w:val="19"/>
+        </w:rPr>
+        <w:t>อาจโดนถาม:</w:t>
+      </w:r>
+      <w:r>
+        <w:rPr>
+          <w:rFonts w:ascii="Leelawadee UI" w:hAnsi="Leelawadee UI" w:cs="Leelawadee UI" w:eastAsia="Leelawadee UI"/>
+          <w:color w:val="66756B"/>
+          <w:sz w:val="19"/>
+          <w:szCs w:val="19"/>
+        </w:rPr>
+        <w:t xml:space="preserve"> ทำไมรวม 3 service ใน container เดียว? → Render free ให้ 1 service = 1 พอร์ตสาธารณะ และ Guard/RAG ไม่ควรให้คนนอกเรียกตรง จึงฟังแค่ภายใน container</w:t>
+      </w:r>
+    </w:p>
     <w:p>
       <w:pPr>
         <w:keepNext/>

</xml_diff>